<commit_message>
feat(mechanism): complete analysis phase -- corrected clock, adjudicated tests, instruments, dollars
Everything outstanding from the mechanism program: Tasks 1-1d (gross-world payment
formula, +10h timestamp fix at source), Task 2 registered test (RQ1/RQ2), Jobs 1-2
(before/after re-establishment; contamination -- clean-day estimates govern), horizon
stance, within-bid gates (Parts 0-1-4), instrumentation pass (5 instruments, validation
gate, registered Part 3 + ramp anatomy), Tasks A/B (bid displacement ~0; direction
channel $141.9M vs $7.2M at spot, 20:1), staged-interpretation framework with both open
checks resolved. Scripts, findings, CSVs, session logs; raw AEMO caches and bulky
regenerable panels gitignored.

Co-Authored-By: Claude Fable 5 <noreply@anthropic.com>
</commit_message>
<xml_diff>
--- a/Direction/outputs/docs/proposal.docx
+++ b/Direction/outputs/docs/proposal.docx
@@ -15,7 +15,7 @@
         <w:pStyle w:val="Normal"/>
       </w:pPr>
       <w:r>
-        <w:t xml:space="preserve">Research proposal. Monash University. Draft 2026-06-20.</w:t>
+        <w:t xml:space="preserve">Research proposal. Monash University. Draft 2026-06-29.</w:t>
       </w:r>
     </w:p>
     <w:p>
@@ -47,6 +47,67 @@
         <w:pStyle w:val="Normal"/>
       </w:pPr>
       <w:r>
+        <w:t xml:space="preserve">The resulting compensation bill is large and persistent, and it does not move with directed volume. The quarters with the highest compensation are not the quarters with the most directed energy: a small directed volume in late 2022 and early 2023 produced the largest bills, because each megawatt-hour was paid the inflated, slow-moving directed price (Figure 1).</w:t>
+      </w:r>
+    </w:p>
+    <w:p>
+      <w:pPr>
+        <w:pStyle w:val="Normal"/>
+      </w:pPr>
+      <w:r>
+        <w:rPr/>
+        <w:drawing>
+          <wp:inline distT="0" distB="0" distL="0" distR="0">
+            <wp:extent cx="5669280" cy="3008376"/>
+            <wp:docPr id="1" name="" descr=""/>
+            <wp:cNvGraphicFramePr>
+              <a:graphicFrameLocks xmlns:a="http://schemas.openxmlformats.org/drawingml/2006/main" noChangeAspect="1"/>
+            </wp:cNvGraphicFramePr>
+            <a:graphic xmlns:a="http://schemas.openxmlformats.org/drawingml/2006/main">
+              <a:graphicData uri="http://schemas.openxmlformats.org/drawingml/2006/picture">
+                <pic:pic xmlns:pic="http://schemas.openxmlformats.org/drawingml/2006/picture">
+                  <pic:nvPicPr>
+                    <pic:cNvPr id="2" name=""/>
+                    <pic:cNvPicPr>
+                      <a:picLocks noChangeAspect="1" noChangeArrowheads="1"/>
+                    </pic:cNvPicPr>
+                  </pic:nvPicPr>
+                  <pic:blipFill>
+                    <a:blip r:embed="rId7"/>
+                    <a:stretch>
+                      <a:fillRect/>
+                    </a:stretch>
+                  </pic:blipFill>
+                  <pic:spPr bwMode="auto">
+                    <a:xfrm>
+                      <a:off x="0" y="0"/>
+                      <a:ext cx="5669280" cy="3008376"/>
+                    </a:xfrm>
+                    <a:prstGeom prst="rect">
+                      <a:avLst/>
+                    </a:prstGeom>
+                    <a:noFill/>
+                  </pic:spPr>
+                </pic:pic>
+              </a:graphicData>
+            </a:graphic>
+          </wp:inline>
+        </w:drawing>
+      </w:r>
+    </w:p>
+    <w:p>
+      <w:pPr>
+        <w:pStyle w:val="Normal"/>
+      </w:pPr>
+      <w:r>
+        <w:t xml:space="preserve">Figure 1. Energy generated under direction (bars) and total compensation paid (line), by quarter, 2021-2024. The highest-cost quarters are not the highest-volume quarters.</w:t>
+      </w:r>
+    </w:p>
+    <w:p>
+      <w:pPr>
+        <w:pStyle w:val="Normal"/>
+      </w:pPr>
+      <w:r>
         <w:t xml:space="preserve">A large, reliable rent for being directed creates an incentive to be directed. This proposal asks whether SA synchronous generators act on that incentive by withholding capacity, and whether the behaviour is concentrated where it can actually work, namely in units that are pivotal for system strength. Preliminary descriptive evidence assembled for this proposal is affirmative and sharp: within a unit, being pivotal for system strength raises the share of capacity offered above marginal cost by 11 to 14 percentage points, a result that survives restriction to undirected market-facing intervals and holds for a pivotality measure constructed from rivals' availability alone [F14]. Pivotal units also actively rebid, withdrawing roughly 40 MW of available capacity intraday and moving 4 to 18 percentage points of capacity above marginal cost across the trading day [F16]. The pivotality state, not the size of the prize, is the dominant margin [F15].</w:t>
       </w:r>
     </w:p>
@@ -55,7 +116,7 @@
         <w:pStyle w:val="Titre1"/>
       </w:pPr>
       <w:r>
-        <w:t xml:space="preserve">2. Institutional background: directions and the directed price</w:t>
+        <w:t xml:space="preserve">2. Institutional background: directions, the directed price, and pivotality</w:t>
       </w:r>
     </w:p>
     <w:p>
@@ -71,15 +132,121 @@
         <w:pStyle w:val="Normal"/>
       </w:pPr>
       <w:r>
-        <w:t xml:space="preserve">This predetermination produces the project's identifying variation. The 2022 SA price spike pushed the trailing 90th percentile to a plateau of about $348-350/MWh across 2022Q3-2023Q1. As the spike intervals rolled out of the trailing window in mid-2023, d_t fell mechanically to about $180/MWh by late 2023 and a trough near $160/MWh in 2024, a 54% decline from peak, on a date computable in advance from price history alone [F1]. The reconstructed d_t series matches realised compensation (DCP/DQ) with a correlation of 0.984 over the sample and 0.997 once the trailing window is fully populated [F2]. Crucially, marginal cost shows no structural break at the d_t exit, so the variation is in the prize, not in cost [F3].</w:t>
-      </w:r>
-    </w:p>
-    <w:p>
-      <w:pPr>
-        <w:pStyle w:val="Normal"/>
-      </w:pPr>
-      <w:r>
-        <w:t xml:space="preserve">System strength is governed by AEMO's published set of acceptable minimum synchronous generator combinations for SA. At any non-synchronous penetration level, security requires that the online synchronous fleet satisfy at least one acceptable combination. This standard is the basis for the pivotality measure below: a unit is pivotal when no acceptable combination can be met without it, so AEMO must keep or direct it on.</w:t>
+        <w:t xml:space="preserve">This predetermination produces the project's identifying variation. The 2022 SA price spike pushed the trailing 90th percentile to a plateau of about $348-350/MWh across 2022Q3-2023Q1. As the spike intervals rolled out of the trailing window in mid-2023, d_t fell mechanically to about $180/MWh by late 2023 and a trough near $160/MWh in 2024, a 54% decline from peak, on a date computable in advance from price history alone [F1]. Because the directed price tracks the previous twelve months of prices rather than today's costs, it keeps paying near-2022 levels well after the units' fuel costs have fallen, so the gap between the directed price and fuel cost — the rent for being directed — is small during the 2022 fuel spike and large once fuel falls in 2023 (Figure 2). The reconstructed d_t series matches realised compensation (DCP/DQ) with a correlation of 0.984 over the sample and 0.997 once the trailing window is fully populated [F2]. Crucially, marginal cost shows no structural break at the d_t exit, so the variation is in the prize, not in cost [F3].</w:t>
+      </w:r>
+    </w:p>
+    <w:p>
+      <w:pPr>
+        <w:pStyle w:val="Normal"/>
+      </w:pPr>
+      <w:r>
+        <w:rPr/>
+        <w:drawing>
+          <wp:inline distT="0" distB="0" distL="0" distR="0">
+            <wp:extent cx="5669280" cy="3008376"/>
+            <wp:docPr id="3" name="" descr=""/>
+            <wp:cNvGraphicFramePr>
+              <a:graphicFrameLocks xmlns:a="http://schemas.openxmlformats.org/drawingml/2006/main" noChangeAspect="1"/>
+            </wp:cNvGraphicFramePr>
+            <a:graphic xmlns:a="http://schemas.openxmlformats.org/drawingml/2006/main">
+              <a:graphicData uri="http://schemas.openxmlformats.org/drawingml/2006/picture">
+                <pic:pic xmlns:pic="http://schemas.openxmlformats.org/drawingml/2006/picture">
+                  <pic:nvPicPr>
+                    <pic:cNvPr id="4" name=""/>
+                    <pic:cNvPicPr>
+                      <a:picLocks noChangeAspect="1" noChangeArrowheads="1"/>
+                    </pic:cNvPicPr>
+                  </pic:nvPicPr>
+                  <pic:blipFill>
+                    <a:blip r:embed="rId8"/>
+                    <a:stretch>
+                      <a:fillRect/>
+                    </a:stretch>
+                  </pic:blipFill>
+                  <pic:spPr bwMode="auto">
+                    <a:xfrm>
+                      <a:off x="0" y="0"/>
+                      <a:ext cx="5669280" cy="3008376"/>
+                    </a:xfrm>
+                    <a:prstGeom prst="rect">
+                      <a:avLst/>
+                    </a:prstGeom>
+                    <a:noFill/>
+                  </pic:spPr>
+                </pic:pic>
+              </a:graphicData>
+            </a:graphic>
+          </wp:inline>
+        </w:drawing>
+      </w:r>
+    </w:p>
+    <w:p>
+      <w:pPr>
+        <w:pStyle w:val="Normal"/>
+      </w:pPr>
+      <w:r>
+        <w:t xml:space="preserve">Figure 2. The directed price d_t (a trailing-365-day 90th percentile of SA spot) against the Adelaide wholesale gas price. The slow-moving prize stays high after fuel costs fall, opening a small rent during the 2022 fuel spike and a large rent in 2023.</w:t>
+      </w:r>
+    </w:p>
+    <w:p>
+      <w:pPr>
+        <w:pStyle w:val="Normal"/>
+      </w:pPr>
+      <w:r>
+        <w:t xml:space="preserve">System strength in SA is governed by AEMO's published set of acceptable minimum combinations of synchronous units. Because the grid is synchronous-thin, secure operation requires that the synchronous generators online at any moment satisfy at least one acceptable combination; as non-synchronous wind and solar output rises, the admissible combinations become scarcer and stricter. We use this standard to define pivotality precisely: a unit is pivotal in a five-minute interval when no acceptable combination of the other available synchronous units can be formed without it, so the security requirement cannot be met unless that unit is kept on or directed on. We separate a unit that is pivotal given the fleet actually running from one that is pivotal to keep the system secure against the sudden loss of its single largest online unit (the N-1 standard AEMO operates to). Figure 3 shows this is the common case: 58% of directed unit-intervals are pivotal given the units actually running, a further 14% are pivotal to keep the system N-1 secure, and only 28% are non-pivotal. Most directions therefore fall on units that are genuinely essential rather than redundant — the precondition for the withholding-to-be-directed channel this proposal studies.</w:t>
+      </w:r>
+    </w:p>
+    <w:p>
+      <w:pPr>
+        <w:pStyle w:val="Normal"/>
+      </w:pPr>
+      <w:r>
+        <w:rPr/>
+        <w:drawing>
+          <wp:inline distT="0" distB="0" distL="0" distR="0">
+            <wp:extent cx="5669280" cy="3401568"/>
+            <wp:docPr id="5" name="" descr=""/>
+            <wp:cNvGraphicFramePr>
+              <a:graphicFrameLocks xmlns:a="http://schemas.openxmlformats.org/drawingml/2006/main" noChangeAspect="1"/>
+            </wp:cNvGraphicFramePr>
+            <a:graphic xmlns:a="http://schemas.openxmlformats.org/drawingml/2006/main">
+              <a:graphicData uri="http://schemas.openxmlformats.org/drawingml/2006/picture">
+                <pic:pic xmlns:pic="http://schemas.openxmlformats.org/drawingml/2006/picture">
+                  <pic:nvPicPr>
+                    <pic:cNvPr id="6" name=""/>
+                    <pic:cNvPicPr>
+                      <a:picLocks noChangeAspect="1" noChangeArrowheads="1"/>
+                    </pic:cNvPicPr>
+                  </pic:nvPicPr>
+                  <pic:blipFill>
+                    <a:blip r:embed="rId9"/>
+                    <a:stretch>
+                      <a:fillRect/>
+                    </a:stretch>
+                  </pic:blipFill>
+                  <pic:spPr bwMode="auto">
+                    <a:xfrm>
+                      <a:off x="0" y="0"/>
+                      <a:ext cx="5669280" cy="3401568"/>
+                    </a:xfrm>
+                    <a:prstGeom prst="rect">
+                      <a:avLst/>
+                    </a:prstGeom>
+                    <a:noFill/>
+                  </pic:spPr>
+                </pic:pic>
+              </a:graphicData>
+            </a:graphic>
+          </wp:inline>
+        </w:drawing>
+      </w:r>
+    </w:p>
+    <w:p>
+      <w:pPr>
+        <w:pStyle w:val="Normal"/>
+      </w:pPr>
+      <w:r>
+        <w:t xml:space="preserve">Figure 3. Composition of directed unit-intervals by how essential the directed unit was, 2022-2024. A unit is counted pivotal when no combination of the other available SA synchronous units could meet the system-strength requirement without it.</w:t>
       </w:r>
     </w:p>
     <w:p>
@@ -167,7 +334,145 @@
         <w:pStyle w:val="Titre1"/>
       </w:pPr>
       <w:r>
-        <w:t xml:space="preserve">5. Identification</w:t>
+        <w:t xml:space="preserve">5. Descriptive evidence</w:t>
+      </w:r>
+    </w:p>
+    <w:p>
+      <w:pPr>
+        <w:pStyle w:val="Normal"/>
+      </w:pPr>
+      <w:r>
+        <w:t xml:space="preserve">Two preliminary patterns, assembled for this proposal from the 5-minute bid data, speak directly to conduct. Both use the pivotality measure defined above, and both express price withholding as the share of a unit's capacity offered above $300/MWh — a level well above these units' fuel cost of roughly $100/MWh, used here as a simple, model-free withholding threshold.</w:t>
+      </w:r>
+    </w:p>
+    <w:p>
+      <w:pPr>
+        <w:pStyle w:val="Normal"/>
+      </w:pPr>
+      <w:r>
+        <w:t xml:space="preserve">Bidding shifts with pivotality. Figure 4 compares three groups of unit-days: every day, days the unit was directed, and directed days on which the unit was pivotal. The number of intraday rebids is essentially flat across the three groups, and the intraday change in available capacity turns negative on direction days, mechanically, because a directed unit is required to add output. The informative margin is price: the share of capacity offered above $300/MWh rises from 77% on an average day to 82% on direction days and 84% on directed days when the unit is pivotal. Units price more of their capacity high precisely when they are essential.</w:t>
+      </w:r>
+    </w:p>
+    <w:p>
+      <w:pPr>
+        <w:pStyle w:val="Normal"/>
+      </w:pPr>
+      <w:r>
+        <w:rPr/>
+        <w:drawing>
+          <wp:inline distT="0" distB="0" distL="0" distR="0">
+            <wp:extent cx="5669280" cy="2368296"/>
+            <wp:docPr id="7" name="" descr=""/>
+            <wp:cNvGraphicFramePr>
+              <a:graphicFrameLocks xmlns:a="http://schemas.openxmlformats.org/drawingml/2006/main" noChangeAspect="1"/>
+            </wp:cNvGraphicFramePr>
+            <a:graphic xmlns:a="http://schemas.openxmlformats.org/drawingml/2006/main">
+              <a:graphicData uri="http://schemas.openxmlformats.org/drawingml/2006/picture">
+                <pic:pic xmlns:pic="http://schemas.openxmlformats.org/drawingml/2006/picture">
+                  <pic:nvPicPr>
+                    <pic:cNvPr id="8" name=""/>
+                    <pic:cNvPicPr>
+                      <a:picLocks noChangeAspect="1" noChangeArrowheads="1"/>
+                    </pic:cNvPicPr>
+                  </pic:nvPicPr>
+                  <pic:blipFill>
+                    <a:blip r:embed="rId10"/>
+                    <a:stretch>
+                      <a:fillRect/>
+                    </a:stretch>
+                  </pic:blipFill>
+                  <pic:spPr bwMode="auto">
+                    <a:xfrm>
+                      <a:off x="0" y="0"/>
+                      <a:ext cx="5669280" cy="2368296"/>
+                    </a:xfrm>
+                    <a:prstGeom prst="rect">
+                      <a:avLst/>
+                    </a:prstGeom>
+                    <a:noFill/>
+                  </pic:spPr>
+                </pic:pic>
+              </a:graphicData>
+            </a:graphic>
+          </wp:inline>
+        </w:drawing>
+      </w:r>
+    </w:p>
+    <w:p>
+      <w:pPr>
+        <w:pStyle w:val="Normal"/>
+      </w:pPr>
+      <w:r>
+        <w:t xml:space="preserve">Figure 4. Rebidding behaviour across three groups of unit-days for the pivotal-capable SA gas units: every day, direction days, and pivotal direction days. Averages per unit-day.</w:t>
+      </w:r>
+    </w:p>
+    <w:p>
+      <w:pPr>
+        <w:pStyle w:val="Normal"/>
+      </w:pPr>
+      <w:r>
+        <w:t xml:space="preserve">The repositioning precedes the direction. Figure 5 follows the offer for the directed intervals from a unit's first bid version to its last version submitted before the direction is issued, on a clock measured in hours before issue and expressed as the change since that first version. The share of capacity offered above $300/MWh rises by two to six percentage points over the run-up, for both Synchronise (start-up) and Remain (keep-running) directions and whether we use the whole directed window or only its first hour; the available-capacity margin is noisier. The pattern is consistent with units positioning their offers in anticipation of being directed, not merely responding once directed.</w:t>
+      </w:r>
+    </w:p>
+    <w:p>
+      <w:pPr>
+        <w:pStyle w:val="Normal"/>
+      </w:pPr>
+      <w:r>
+        <w:rPr/>
+        <w:drawing>
+          <wp:inline distT="0" distB="0" distL="0" distR="0">
+            <wp:extent cx="5669280" cy="3456432"/>
+            <wp:docPr id="9" name="" descr=""/>
+            <wp:cNvGraphicFramePr>
+              <a:graphicFrameLocks xmlns:a="http://schemas.openxmlformats.org/drawingml/2006/main" noChangeAspect="1"/>
+            </wp:cNvGraphicFramePr>
+            <a:graphic xmlns:a="http://schemas.openxmlformats.org/drawingml/2006/main">
+              <a:graphicData uri="http://schemas.openxmlformats.org/drawingml/2006/picture">
+                <pic:pic xmlns:pic="http://schemas.openxmlformats.org/drawingml/2006/picture">
+                  <pic:nvPicPr>
+                    <pic:cNvPr id="10" name=""/>
+                    <pic:cNvPicPr>
+                      <a:picLocks noChangeAspect="1" noChangeArrowheads="1"/>
+                    </pic:cNvPicPr>
+                  </pic:nvPicPr>
+                  <pic:blipFill>
+                    <a:blip r:embed="rId11"/>
+                    <a:stretch>
+                      <a:fillRect/>
+                    </a:stretch>
+                  </pic:blipFill>
+                  <pic:spPr bwMode="auto">
+                    <a:xfrm>
+                      <a:off x="0" y="0"/>
+                      <a:ext cx="5669280" cy="3456432"/>
+                    </a:xfrm>
+                    <a:prstGeom prst="rect">
+                      <a:avLst/>
+                    </a:prstGeom>
+                    <a:noFill/>
+                  </pic:spPr>
+                </pic:pic>
+              </a:graphicData>
+            </a:graphic>
+          </wp:inline>
+        </w:drawing>
+      </w:r>
+    </w:p>
+    <w:p>
+      <w:pPr>
+        <w:pStyle w:val="Normal"/>
+      </w:pPr>
+      <w:r>
+        <w:t xml:space="preserve">Figure 5. Change in the offer for the directed intervals, from each direction episode's first bid version to its last version before the direction is issued (0 = issued). Rows: capacity offered and share offered above $300/MWh; columns: the full directed period and its first hour; lines: Synchronise versus Remain.</w:t>
+      </w:r>
+    </w:p>
+    <w:p>
+      <w:pPr>
+        <w:pStyle w:val="Titre1"/>
+      </w:pPr>
+      <w:r>
+        <w:t xml:space="preserve">6. Identification</w:t>
       </w:r>
     </w:p>
     <w:p>
@@ -175,7 +480,7 @@
         <w:pStyle w:val="Titre2"/>
       </w:pPr>
       <w:r>
-        <w:t xml:space="preserve">5.1 Design 1: window-exit event study</w:t>
+        <w:t xml:space="preserve">6.1 Design 1: window-exit event study</w:t>
       </w:r>
     </w:p>
     <w:p>
@@ -191,7 +496,7 @@
         <w:pStyle w:val="Titre2"/>
       </w:pPr>
       <w:r>
-        <w:t xml:space="preserve">5.2 Design 2: triple-difference, d_t x pivotality x tightness</w:t>
+        <w:t xml:space="preserve">6.2 Design 2: triple-difference, d_t x pivotality x tightness</w:t>
       </w:r>
     </w:p>
     <w:p>
@@ -207,7 +512,7 @@
         <w:pStyle w:val="Titre1"/>
       </w:pPr>
       <w:r>
-        <w:t xml:space="preserve">6. Methodology</w:t>
+        <w:t xml:space="preserve">7. Methodology</w:t>
       </w:r>
     </w:p>
     <w:p>
@@ -234,220 +539,6 @@
         <w:t xml:space="preserve">A structural extension is future work: a model of the unit's joint price-and-availability bidding under the system-strength constraint and the directed-price option, which would let the directed-price reform be evaluated counterfactually rather than only descriptively. It is not required for the reduced-form contribution.</w:t>
       </w:r>
     </w:p>
-    <w:p>
-      <w:pPr>
-        <w:pStyle w:val="Titre1"/>
-      </w:pPr>
-      <w:r>
-        <w:t xml:space="preserve">7. Contribution</w:t>
-      </w:r>
-    </w:p>
-    <w:p>
-      <w:pPr>
-        <w:pStyle w:val="Normal"/>
-      </w:pPr>
-      <w:r>
-        <w:t xml:space="preserve">•  First measurement of system-strength pivotality from AEMO's published minimum-combination standard, validated against realised directions [F13]; a portable method for any constrained synchronous-thin grid.</w:t>
-      </w:r>
-    </w:p>
-    <w:p>
-      <w:pPr>
-        <w:pStyle w:val="Normal"/>
-      </w:pPr>
-      <w:r>
-        <w:t xml:space="preserve">•  Evidence that withholding tracks the pivotality state, not merely the size of the directed-price prize [F15], and that it operates on both the price and quantity margins through active intraday rebidding [F16].</w:t>
-      </w:r>
-    </w:p>
-    <w:p>
-      <w:pPr>
-        <w:pStyle w:val="Normal"/>
-      </w:pPr>
-      <w:r>
-        <w:t xml:space="preserve">•  A clean, predetermined source of variation (the trailing-window d_t exit) and an exogenous pivotality instrument (rivals' availability and weather-driven non-synchronous penetration) that together address the endogeneity of withholding to market power [F14].</w:t>
-      </w:r>
-    </w:p>
-    <w:p>
-      <w:pPr>
-        <w:pStyle w:val="Normal"/>
-      </w:pPr>
-      <w:r>
-        <w:t xml:space="preserve">•  Direct policy relevance: AEMO has proposed replacing the 90th-percentile directed-price methodology; this work quantifies the conduct the current rule induces.</w:t>
-      </w:r>
-    </w:p>
-    <w:p>
-      <w:pPr>
-        <w:pStyle w:val="Titre1"/>
-      </w:pPr>
-      <w:r>
-        <w:t xml:space="preserve">8. Timeline (6 months)</w:t>
-      </w:r>
-    </w:p>
-    <w:tbl>
-      <w:tblPr>
-        <w:tblStyle w:val="tabletemplate"/>
-        <w:tblLayout w:type="autofit"/>
-        <w:jc w:val="center"/>
-        <w:tblW w:type="pct" w:w="5000"/>
-        <w:tblLook w:firstRow="1" w:lastRow="0" w:firstColumn="0" w:lastColumn="0" w:noHBand="0" w:noVBand="1"/>
-      </w:tblPr>
-      <w:tr>
-        <w:trPr>
-          <w:tblHeader/>
-        </w:trPr>
-        <w:tc>
-          <w:p>
-            <w:pPr>
-              <w:pStyle w:val="Normal"/>
-            </w:pPr>
-            <w:r>
-              <w:t>Month</w:t>
-            </w:r>
-          </w:p>
-        </w:tc>
-        <w:tc>
-          <w:p>
-            <w:pPr>
-              <w:pStyle w:val="Normal"/>
-            </w:pPr>
-            <w:r>
-              <w:t>Activity</w:t>
-            </w:r>
-          </w:p>
-        </w:tc>
-      </w:tr>
-      <w:tr>
-        <w:tc>
-          <w:p>
-            <w:pPr>
-              <w:pStyle w:val="Normal"/>
-            </w:pPr>
-            <w:r>
-              <w:t>1</w:t>
-            </w:r>
-          </w:p>
-        </w:tc>
-        <w:tc>
-          <w:p>
-            <w:pPr>
-              <w:pStyle w:val="Normal"/>
-            </w:pPr>
-            <w:r>
-              <w:t>Finalise variable construction; requirement-active flag from the reason field; offline-but-available indicator.</w:t>
-            </w:r>
-          </w:p>
-        </w:tc>
-      </w:tr>
-      <w:tr>
-        <w:tc>
-          <w:p>
-            <w:pPr>
-              <w:pStyle w:val="Normal"/>
-            </w:pPr>
-            <w:r>
-              <w:t>2</w:t>
-            </w:r>
-          </w:p>
-        </w:tc>
-        <w:tc>
-          <w:p>
-            <w:pPr>
-              <w:pStyle w:val="Normal"/>
-            </w:pPr>
-            <w:r>
-              <w:t>Design 1 event study with rebuilt outcome; pre-trend tests; placebo on Remain.</w:t>
-            </w:r>
-          </w:p>
-        </w:tc>
-      </w:tr>
-      <w:tr>
-        <w:tc>
-          <w:p>
-            <w:pPr>
-              <w:pStyle w:val="Normal"/>
-            </w:pPr>
-            <w:r>
-              <w:t>3</w:t>
-            </w:r>
-          </w:p>
-        </w:tc>
-        <w:tc>
-          <w:p>
-            <w:pPr>
-              <w:pStyle w:val="Normal"/>
-            </w:pPr>
-            <w:r>
-              <w:t>Design 2 triple-difference; ex-ante pivotality and non-sync interactions; heterogeneity by unit.</w:t>
-            </w:r>
-          </w:p>
-        </w:tc>
-      </w:tr>
-      <w:tr>
-        <w:tc>
-          <w:p>
-            <w:pPr>
-              <w:pStyle w:val="Normal"/>
-            </w:pPr>
-            <w:r>
-              <w:t>4</w:t>
-            </w:r>
-          </w:p>
-        </w:tc>
-        <w:tc>
-          <w:p>
-            <w:pPr>
-              <w:pStyle w:val="Normal"/>
-            </w:pPr>
-            <w:r>
-              <w:t>Wild-cluster-bootstrap inference across all headline specifications; robustness (binary-station pivotality, lags, risk-island combinations).</w:t>
-            </w:r>
-          </w:p>
-        </w:tc>
-      </w:tr>
-      <w:tr>
-        <w:tc>
-          <w:p>
-            <w:pPr>
-              <w:pStyle w:val="Normal"/>
-            </w:pPr>
-            <w:r>
-              <w:t>5</w:t>
-            </w:r>
-          </w:p>
-        </w:tc>
-        <w:tc>
-          <w:p>
-            <w:pPr>
-              <w:pStyle w:val="Normal"/>
-            </w:pPr>
-            <w:r>
-              <w:t>Merge realised compensation dollars; quantify rent captured; TIB case study.</w:t>
-            </w:r>
-          </w:p>
-        </w:tc>
-      </w:tr>
-      <w:tr>
-        <w:tc>
-          <w:p>
-            <w:pPr>
-              <w:pStyle w:val="Normal"/>
-            </w:pPr>
-            <w:r>
-              <w:t>6</w:t>
-            </w:r>
-          </w:p>
-        </w:tc>
-        <w:tc>
-          <w:p>
-            <w:pPr>
-              <w:pStyle w:val="Normal"/>
-            </w:pPr>
-            <w:r>
-              <w:t>Draft paper; internal review; policy section on the directed-price reform.</w:t>
-            </w:r>
-          </w:p>
-        </w:tc>
-      </w:tr>
-    </w:tbl>
     <w:p>
       <w:pPr>
         <w:pStyle w:val="Titre1"/>

</xml_diff>